<commit_message>
Fix equations, figure images, and covariate variable names in Curieux submission
- Render all 4 equations with proper superscript/subscript formatting instead of placeholders
- Embed Figure 1 (common support) and Figure 2 (depression coefplot) inline in body text
- Replace raw variable names BP_NATIONAL_RANK, BUILDINGS_FRACTION_DE, RUCC2013 with natural language throughout
- Adjust content to maintain 20 body pages with embedded figures (21 total pages, Works Cited on p.21)

Co-Authored-By: Claude Sonnet 4.6 <noreply@anthropic.com>
</commit_message>
<xml_diff>
--- a/Curieux_Submission/manuscript.docx
+++ b/Curieux_Submission/manuscript.docx
@@ -392,17 +392,72 @@
     </w:p>
     <w:p>
       <w:pPr>
-        <w:spacing w:line="276" w:lineRule="auto" w:before="80" w:after="80"/>
+        <w:spacing w:line="276" w:lineRule="auto" w:before="160" w:after="160"/>
         <w:jc w:val="center"/>
       </w:pPr>
       <w:r>
         <w:rPr>
           <w:rFonts w:ascii="Times New Roman" w:hAnsi="Times New Roman"/>
-          <w:b w:val="0"/>
           <w:i/>
           <w:sz w:val="24"/>
         </w:rPr>
-        <w:t>[ Equation 1 ]</w:t>
+        <w:t>PctBurned</w:t>
+      </w:r>
+      <w:r>
+        <w:rPr>
+          <w:rFonts w:ascii="Times New Roman" w:hAnsi="Times New Roman"/>
+          <w:i/>
+          <w:sz w:val="24"/>
+          <w:vertAlign w:val="subscript"/>
+        </w:rPr>
+        <w:t>c</w:t>
+      </w:r>
+      <w:r>
+        <w:rPr>
+          <w:rFonts w:ascii="Times New Roman" w:hAnsi="Times New Roman"/>
+          <w:i w:val="0"/>
+          <w:sz w:val="24"/>
+        </w:rPr>
+        <w:t xml:space="preserve">  =  (Acres burned in county </w:t>
+      </w:r>
+      <w:r>
+        <w:rPr>
+          <w:rFonts w:ascii="Times New Roman" w:hAnsi="Times New Roman"/>
+          <w:i/>
+          <w:sz w:val="24"/>
+        </w:rPr>
+        <w:t>c</w:t>
+      </w:r>
+      <w:r>
+        <w:rPr>
+          <w:rFonts w:ascii="Times New Roman" w:hAnsi="Times New Roman"/>
+          <w:i w:val="0"/>
+          <w:sz w:val="24"/>
+        </w:rPr>
+        <w:t xml:space="preserve">, 2015)  ÷  (Land area of county </w:t>
+      </w:r>
+      <w:r>
+        <w:rPr>
+          <w:rFonts w:ascii="Times New Roman" w:hAnsi="Times New Roman"/>
+          <w:i/>
+          <w:sz w:val="24"/>
+        </w:rPr>
+        <w:t>c</w:t>
+      </w:r>
+      <w:r>
+        <w:rPr>
+          <w:rFonts w:ascii="Times New Roman" w:hAnsi="Times New Roman"/>
+          <w:i w:val="0"/>
+          <w:sz w:val="24"/>
+        </w:rPr>
+        <w:t xml:space="preserve">  in acres)</w:t>
+      </w:r>
+      <w:r>
+        <w:rPr>
+          <w:rFonts w:ascii="Times New Roman" w:hAnsi="Times New Roman"/>
+          <w:sz w:val="24"/>
+        </w:rPr>
+        <w:t xml:space="preserve">    (1)</w:t>
       </w:r>
     </w:p>
     <w:p>
@@ -512,7 +567,7 @@
           <w:i w:val="0"/>
           <w:sz w:val="24"/>
         </w:rPr>
-        <w:t>Wildfire Hazard Potential (WHP).  Structural wildfire risk is measured using the Wildfire Risk to Communities (WRC) county-level dataset published by the U.S. Forest Service. The primary matching variable, BP_NATIONAL_RANK, is the national percentile rank of each county's mean annual burn probability as simulated by FSim, a physics-based large-fire simulation model that uses LANDFIRE vegetation and fuel data together with historical weather statistics. Because FSim simulates fire behavior from landscape characteristics rather than historical fire occurrence, BP_NATIONAL_RANK is plausibly exogenous to realized wildfire events and serves as a pre-treatment measure of structural fire risk. A second WRC variable, BUILDINGS_FRACTION_DE, measures the share of county buildings in the Direct Exposure WHP zone, which is the highest-risk category, and enters the matching procedure alongside the rank measure.</w:t>
+        <w:t>Wildfire Hazard Potential (WHP).  Structural wildfire risk is measured using the Wildfire Risk to Communities (WRC) county-level dataset published by the U.S. Forest Service. The primary matching variable, WHP national rank, is the national percentile rank of each county's mean annual burn probability as simulated by FSim, a physics-based large-fire simulation model that uses LANDFIRE vegetation and fuel data together with historical weather statistics. Because FSim simulates fire behavior from landscape characteristics rather than historical fire occurrence, WHP national rank is plausibly exogenous to realized wildfire events and serves as a pre-treatment measure of structural fire risk. A second WRC variable measures the share of county buildings in the Direct Exposure WHP zone, which is the highest-risk category, and enters the matching procedure alongside the rank measure.</w:t>
       </w:r>
     </w:p>
     <w:p>
@@ -528,7 +583,7 @@
           <w:i w:val="0"/>
           <w:sz w:val="24"/>
         </w:rPr>
-        <w:t>The FSim simulation model is run by the Forest Service and produces a spatially explicit estimate of large-fire probability for every raster cell in the contiguous United States. The county-level BP_NATIONAL_RANK variable aggregates these cell-level probabilities to the county level and ranks them nationally, with higher values indicating higher structural fire risk. Because FSim uses physical fire behavior modeling based on vegetation fuel loads, terrain slope and aspect, and historical wind and weather data, rather than historical fire occurrence records, the rank measure is not contaminated by the actual realization of fires in any given year. This is precisely the property needed for a pre-treatment matching variable: it captures structural risk rather than realized exposure, and it is derived from pre-season fuel conditions rather than post-fire outcomes. Counties with BP_NATIONAL_RANK in the upper quintile face a level of structural fire risk that is, by design, independent of whether any specific fire actually occurred in a given year.</w:t>
+        <w:t>The FSim simulation model is run by the Forest Service and produces a spatially explicit estimate of large-fire probability for every raster cell in the contiguous United States. The county-level WHP national rank variable aggregates these cell-level probabilities to the county level and ranks them nationally, with higher values indicating higher structural fire risk. Because FSim uses physical fire behavior modeling based on vegetation fuel loads, terrain slope and aspect, and historical wind and weather data, rather than historical fire occurrence records, the rank measure is not contaminated by the actual realization of fires in any given year. This is precisely the property needed for a pre-treatment matching variable: it captures structural risk rather than realized exposure, and it is derived from pre-season fuel conditions rather than post-fire outcomes. Counties with WHP national rank in the upper quintile face a level of structural fire risk that is, by design, independent of whether any specific fire actually occurred in a given year.</w:t>
       </w:r>
     </w:p>
     <w:p>
@@ -1988,7 +2043,7 @@
           <w:i w:val="0"/>
           <w:sz w:val="24"/>
         </w:rPr>
-        <w:t>I first assign each Western county to one of five quintiles of BP_NATIONAL_RANK, the FSim-derived structural burn probability measure described in Section 2. Control counties can only be matched to treated counties within the same WHP quintile, ensuring that every treated unit is compared to counties facing equal structural wildfire risk. Within a WHP quintile, counties share broadly similar vegetation type, climate zone, topography, and rural economic profile, which are the characteristics most likely to generate correlated mental health trends independent of wildfire occurrence. Because the WHP raster was last updated with 2014 LANDFIRE data before the 2015 fire season, quintile assignments are pre-treatment and not contaminated by post-fire vegetation changes.</w:t>
+        <w:t>I first assign each Western county to one of five quintiles of WHP national rank, the FSim-derived structural burn probability measure described in Section 2. Control counties can only be matched to treated counties within the same WHP quintile, ensuring that every treated unit is compared to counties facing equal structural wildfire risk. Within a WHP quintile, counties share broadly similar vegetation type, climate zone, topography, and rural economic profile, which are the characteristics most likely to generate correlated mental health trends independent of wildfire occurrence. Because the WHP raster was last updated with 2014 LANDFIRE data before the 2015 fire season, quintile assignments are pre-treatment and not contaminated by post-fire vegetation changes.</w:t>
       </w:r>
     </w:p>
     <w:p>
@@ -2040,17 +2095,132 @@
     </w:p>
     <w:p>
       <w:pPr>
-        <w:spacing w:line="276" w:lineRule="auto" w:before="80" w:after="80"/>
+        <w:spacing w:line="276" w:lineRule="auto" w:before="160" w:after="160"/>
         <w:jc w:val="center"/>
       </w:pPr>
       <w:r>
         <w:rPr>
           <w:rFonts w:ascii="Times New Roman" w:hAnsi="Times New Roman"/>
-          <w:b w:val="0"/>
           <w:i/>
           <w:sz w:val="24"/>
         </w:rPr>
-        <w:t>[ Equation 1 ]</w:t>
+        <w:t>d</w:t>
+      </w:r>
+      <w:r>
+        <w:rPr>
+          <w:rFonts w:ascii="Times New Roman" w:hAnsi="Times New Roman"/>
+          <w:i w:val="0"/>
+          <w:sz w:val="24"/>
+        </w:rPr>
+        <w:t>(t, c)  =  √[ (x</w:t>
+      </w:r>
+      <w:r>
+        <w:rPr>
+          <w:rFonts w:ascii="Times New Roman" w:hAnsi="Times New Roman"/>
+          <w:i/>
+          <w:sz w:val="24"/>
+          <w:vertAlign w:val="subscript"/>
+        </w:rPr>
+        <w:t>t</w:t>
+      </w:r>
+      <w:r>
+        <w:rPr>
+          <w:rFonts w:ascii="Times New Roman" w:hAnsi="Times New Roman"/>
+          <w:i w:val="0"/>
+          <w:sz w:val="24"/>
+        </w:rPr>
+        <w:t xml:space="preserve">  −  x</w:t>
+      </w:r>
+      <w:r>
+        <w:rPr>
+          <w:rFonts w:ascii="Times New Roman" w:hAnsi="Times New Roman"/>
+          <w:i/>
+          <w:sz w:val="24"/>
+          <w:vertAlign w:val="subscript"/>
+        </w:rPr>
+        <w:t>c</w:t>
+      </w:r>
+      <w:r>
+        <w:rPr>
+          <w:rFonts w:ascii="Times New Roman" w:hAnsi="Times New Roman"/>
+          <w:i w:val="0"/>
+          <w:sz w:val="24"/>
+        </w:rPr>
+        <w:t>)</w:t>
+      </w:r>
+      <w:r>
+        <w:rPr>
+          <w:rFonts w:ascii="Times New Roman" w:hAnsi="Times New Roman"/>
+          <w:i w:val="0"/>
+          <w:sz w:val="24"/>
+          <w:vertAlign w:val="superscript"/>
+        </w:rPr>
+        <w:t>T</w:t>
+      </w:r>
+      <w:r>
+        <w:rPr>
+          <w:rFonts w:ascii="Times New Roman" w:hAnsi="Times New Roman"/>
+          <w:i w:val="0"/>
+          <w:sz w:val="24"/>
+        </w:rPr>
+        <w:t xml:space="preserve">  (Σ̂ + λI)</w:t>
+      </w:r>
+      <w:r>
+        <w:rPr>
+          <w:rFonts w:ascii="Times New Roman" w:hAnsi="Times New Roman"/>
+          <w:i w:val="0"/>
+          <w:sz w:val="24"/>
+        </w:rPr>
+        <w:t>⁻¹</w:t>
+      </w:r>
+      <w:r>
+        <w:rPr>
+          <w:rFonts w:ascii="Times New Roman" w:hAnsi="Times New Roman"/>
+          <w:i w:val="0"/>
+          <w:sz w:val="24"/>
+        </w:rPr>
+        <w:t xml:space="preserve">  (x</w:t>
+      </w:r>
+      <w:r>
+        <w:rPr>
+          <w:rFonts w:ascii="Times New Roman" w:hAnsi="Times New Roman"/>
+          <w:i/>
+          <w:sz w:val="24"/>
+          <w:vertAlign w:val="subscript"/>
+        </w:rPr>
+        <w:t>t</w:t>
+      </w:r>
+      <w:r>
+        <w:rPr>
+          <w:rFonts w:ascii="Times New Roman" w:hAnsi="Times New Roman"/>
+          <w:i w:val="0"/>
+          <w:sz w:val="24"/>
+        </w:rPr>
+        <w:t xml:space="preserve">  −  x</w:t>
+      </w:r>
+      <w:r>
+        <w:rPr>
+          <w:rFonts w:ascii="Times New Roman" w:hAnsi="Times New Roman"/>
+          <w:i/>
+          <w:sz w:val="24"/>
+          <w:vertAlign w:val="subscript"/>
+        </w:rPr>
+        <w:t>c</w:t>
+      </w:r>
+      <w:r>
+        <w:rPr>
+          <w:rFonts w:ascii="Times New Roman" w:hAnsi="Times New Roman"/>
+          <w:i w:val="0"/>
+          <w:sz w:val="24"/>
+        </w:rPr>
+        <w:t>) ]</w:t>
+      </w:r>
+      <w:r>
+        <w:rPr>
+          <w:rFonts w:ascii="Times New Roman" w:hAnsi="Times New Roman"/>
+          <w:sz w:val="24"/>
+        </w:rPr>
+        <w:t xml:space="preserve">    (1)</w:t>
       </w:r>
     </w:p>
     <w:p>
@@ -2066,23 +2236,7 @@
           <w:i w:val="0"/>
           <w:sz w:val="24"/>
         </w:rPr>
-        <w:t>where x is the vector of matching covariates, Σ̂ is the sample covariance matrix estimated from pooled treated and control observations within the quintile, and λ = 0.01 × tr(Σ̂) / p is a Tikhonov regularization term (p = 6 covariates) that prevents near-singular inversions in quintiles with few observations. The six matching covariates are: WHP national rank, rural-urban continuum code (RUCC2013), share of buildings in the direct exposure zone (BUILDINGS_FRACTION_DE), a binary indicator for any qualifying wildfire before 2015, 2014 county population, and 2014 median household income. Including these structural and socioeconomic characteristics in the distance metric operationalizes the matching strategy: treated and control counties are close not only on fire risk but on the demographic and economic conditions that most plausibly drive mental health trends.</w:t>
-      </w:r>
-    </w:p>
-    <w:p>
-      <w:pPr>
-        <w:spacing w:line="276" w:lineRule="auto" w:before="0" w:after="0"/>
-        <w:ind w:firstLine="720"/>
-        <w:jc w:val="left"/>
-      </w:pPr>
-      <w:r>
-        <w:rPr>
-          <w:rFonts w:ascii="Times New Roman" w:hAnsi="Times New Roman"/>
-          <w:b w:val="0"/>
-          <w:i w:val="0"/>
-          <w:sz w:val="24"/>
-        </w:rPr>
-        <w:t>The Tikhonov regularization term λ = 0.01 × tr(Σ̂) / p is a small stabilizing constant added to the diagonal of the covariance matrix before inversion. Without regularization, the sample covariance matrix within small quintiles with few control observations can be nearly singular, producing numerically unstable distance calculations. The regularization term shrinks the condition number of the matrix, ensuring that no matching covariate receives an extremely large or small implicit weight due to near-collinearity with other covariates. The scaling by tr(Σ̂) / p normalizes the regularization term to be proportional to the average variance of the covariates, so that the penalty is applied in proportion to the natural scale of the data rather than as an absolute threshold. This approach ensures that the distance metric remains well-conditioned across all five WHP quintiles, including quintiles with fewer than ten potential control counties, without meaningfully distorting the matching priorities established by the covariate selection.</w:t>
+        <w:t>where x is the vector of matching covariates, Σ̂ is the sample covariance matrix estimated from pooled treated and control observations within the quintile, and λ = 0.01 × tr(Σ̂) / p is a Tikhonov regularization term (p = 6 covariates) that prevents near-singular inversions in quintiles with few observations. The six matching covariates are: WHP national rank, rural-urban continuum code, share of buildings in the direct exposure zone, a binary indicator for any qualifying wildfire before 2015, 2014 county population, and 2014 median household income. Including these structural and socioeconomic characteristics in the distance metric operationalizes the matching strategy: treated and control counties are close not only on fire risk but on the demographic and economic conditions that most plausibly drive mental health trends.</w:t>
       </w:r>
     </w:p>
     <w:p>
@@ -2244,6 +2398,61 @@
     </w:p>
     <w:p>
       <w:pPr>
+        <w:spacing w:before="240" w:after="80"/>
+        <w:jc w:val="center"/>
+      </w:pPr>
+      <w:r>
+        <w:drawing>
+          <wp:inline xmlns:a="http://schemas.openxmlformats.org/drawingml/2006/main" xmlns:pic="http://schemas.openxmlformats.org/drawingml/2006/picture">
+            <wp:extent cx="4114800" cy="3082056"/>
+            <wp:docPr id="1" name="Picture 1"/>
+            <wp:cNvGraphicFramePr>
+              <a:graphicFrameLocks noChangeAspect="1"/>
+            </wp:cNvGraphicFramePr>
+            <a:graphic>
+              <a:graphicData uri="http://schemas.openxmlformats.org/drawingml/2006/picture">
+                <pic:pic>
+                  <pic:nvPicPr>
+                    <pic:cNvPr id="0" name="fig_common_support.png"/>
+                    <pic:cNvPicPr/>
+                  </pic:nvPicPr>
+                  <pic:blipFill>
+                    <a:blip r:embed="rId9"/>
+                    <a:stretch>
+                      <a:fillRect/>
+                    </a:stretch>
+                  </pic:blipFill>
+                  <pic:spPr>
+                    <a:xfrm>
+                      <a:off x="0" y="0"/>
+                      <a:ext cx="4114800" cy="3082056"/>
+                    </a:xfrm>
+                    <a:prstGeom prst="rect"/>
+                  </pic:spPr>
+                </pic:pic>
+              </a:graphicData>
+            </a:graphic>
+          </wp:inline>
+        </w:drawing>
+      </w:r>
+    </w:p>
+    <w:p>
+      <w:pPr>
+        <w:spacing w:line="276" w:lineRule="auto" w:before="0" w:after="240"/>
+        <w:jc w:val="center"/>
+      </w:pPr>
+      <w:r>
+        <w:rPr>
+          <w:rFonts w:ascii="Times New Roman" w:hAnsi="Times New Roman"/>
+          <w:b w:val="0"/>
+          <w:i/>
+          <w:sz w:val="20"/>
+        </w:rPr>
+        <w:t>Figure 1. Common Support: Covariate Overlap Between Treated and Matched Controls (T1, ≥1,000 acres). Treated counties experienced a qualifying 2015 wildfire. Controls matched within WHP quintiles via Mahalanobis distance. Near-identical distributions confirm common support across all matching dimensions.</w:t>
+      </w:r>
+    </w:p>
+    <w:p>
+      <w:pPr>
         <w:spacing w:line="276" w:lineRule="auto" w:before="240" w:after="80"/>
         <w:jc w:val="left"/>
       </w:pPr>
@@ -2290,17 +2499,92 @@
     </w:p>
     <w:p>
       <w:pPr>
-        <w:spacing w:line="276" w:lineRule="auto" w:before="80" w:after="80"/>
+        <w:spacing w:line="276" w:lineRule="auto" w:before="160" w:after="160"/>
         <w:jc w:val="center"/>
       </w:pPr>
       <w:r>
         <w:rPr>
           <w:rFonts w:ascii="Times New Roman" w:hAnsi="Times New Roman"/>
-          <w:b w:val="0"/>
           <w:i/>
           <w:sz w:val="24"/>
         </w:rPr>
-        <w:t>[ Equation 2 ]</w:t>
+        <w:t>D</w:t>
+      </w:r>
+      <w:r>
+        <w:rPr>
+          <w:rFonts w:ascii="Times New Roman" w:hAnsi="Times New Roman"/>
+          <w:i/>
+          <w:sz w:val="24"/>
+          <w:vertAlign w:val="subscript"/>
+        </w:rPr>
+        <w:t>c</w:t>
+      </w:r>
+      <w:r>
+        <w:rPr>
+          <w:rFonts w:ascii="Times New Roman" w:hAnsi="Times New Roman"/>
+          <w:i w:val="0"/>
+          <w:sz w:val="24"/>
+          <w:vertAlign w:val="superscript"/>
+        </w:rPr>
+        <w:t>2019</w:t>
+      </w:r>
+      <w:r>
+        <w:rPr>
+          <w:rFonts w:ascii="Times New Roman" w:hAnsi="Times New Roman"/>
+          <w:i w:val="0"/>
+          <w:sz w:val="24"/>
+        </w:rPr>
+        <w:t xml:space="preserve">  =  α  +  β · Treated</w:t>
+      </w:r>
+      <w:r>
+        <w:rPr>
+          <w:rFonts w:ascii="Times New Roman" w:hAnsi="Times New Roman"/>
+          <w:i/>
+          <w:sz w:val="24"/>
+          <w:vertAlign w:val="subscript"/>
+        </w:rPr>
+        <w:t>c</w:t>
+      </w:r>
+      <w:r>
+        <w:rPr>
+          <w:rFonts w:ascii="Times New Roman" w:hAnsi="Times New Roman"/>
+          <w:i w:val="0"/>
+          <w:sz w:val="24"/>
+        </w:rPr>
+        <w:t xml:space="preserve">  +  x</w:t>
+      </w:r>
+      <w:r>
+        <w:rPr>
+          <w:rFonts w:ascii="Times New Roman" w:hAnsi="Times New Roman"/>
+          <w:i/>
+          <w:sz w:val="24"/>
+          <w:vertAlign w:val="subscript"/>
+        </w:rPr>
+        <w:t>c</w:t>
+      </w:r>
+      <w:r>
+        <w:rPr>
+          <w:rFonts w:ascii="Times New Roman" w:hAnsi="Times New Roman"/>
+          <w:i w:val="0"/>
+          <w:sz w:val="24"/>
+        </w:rPr>
+        <w:t>′γ  +  ε</w:t>
+      </w:r>
+      <w:r>
+        <w:rPr>
+          <w:rFonts w:ascii="Times New Roman" w:hAnsi="Times New Roman"/>
+          <w:i/>
+          <w:sz w:val="24"/>
+          <w:vertAlign w:val="subscript"/>
+        </w:rPr>
+        <w:t>c</w:t>
+      </w:r>
+      <w:r>
+        <w:rPr>
+          <w:rFonts w:ascii="Times New Roman" w:hAnsi="Times New Roman"/>
+          <w:sz w:val="24"/>
+        </w:rPr>
+        <w:t xml:space="preserve">    (2)</w:t>
       </w:r>
     </w:p>
     <w:p>
@@ -2368,17 +2652,109 @@
     </w:p>
     <w:p>
       <w:pPr>
-        <w:spacing w:line="276" w:lineRule="auto" w:before="80" w:after="80"/>
+        <w:spacing w:line="276" w:lineRule="auto" w:before="160" w:after="160"/>
         <w:jc w:val="center"/>
       </w:pPr>
       <w:r>
         <w:rPr>
           <w:rFonts w:ascii="Times New Roman" w:hAnsi="Times New Roman"/>
-          <w:b w:val="0"/>
           <w:i/>
           <w:sz w:val="24"/>
         </w:rPr>
-        <w:t>[ Equation 3 ]</w:t>
+        <w:t>D</w:t>
+      </w:r>
+      <w:r>
+        <w:rPr>
+          <w:rFonts w:ascii="Times New Roman" w:hAnsi="Times New Roman"/>
+          <w:i/>
+          <w:sz w:val="24"/>
+          <w:vertAlign w:val="subscript"/>
+        </w:rPr>
+        <w:t>c</w:t>
+      </w:r>
+      <w:r>
+        <w:rPr>
+          <w:rFonts w:ascii="Times New Roman" w:hAnsi="Times New Roman"/>
+          <w:i w:val="0"/>
+          <w:sz w:val="24"/>
+          <w:vertAlign w:val="superscript"/>
+        </w:rPr>
+        <w:t>2019</w:t>
+      </w:r>
+      <w:r>
+        <w:rPr>
+          <w:rFonts w:ascii="Times New Roman" w:hAnsi="Times New Roman"/>
+          <w:i w:val="0"/>
+          <w:sz w:val="24"/>
+        </w:rPr>
+        <w:t xml:space="preserve">  =  α  +  β</w:t>
+      </w:r>
+      <w:r>
+        <w:rPr>
+          <w:rFonts w:ascii="Times New Roman" w:hAnsi="Times New Roman"/>
+          <w:i/>
+          <w:sz w:val="24"/>
+          <w:vertAlign w:val="subscript"/>
+        </w:rPr>
+        <w:t>D</w:t>
+      </w:r>
+      <w:r>
+        <w:rPr>
+          <w:rFonts w:ascii="Times New Roman" w:hAnsi="Times New Roman"/>
+          <w:i w:val="0"/>
+          <w:sz w:val="24"/>
+        </w:rPr>
+        <w:t xml:space="preserve"> · log(1 + PctBurned</w:t>
+      </w:r>
+      <w:r>
+        <w:rPr>
+          <w:rFonts w:ascii="Times New Roman" w:hAnsi="Times New Roman"/>
+          <w:i/>
+          <w:sz w:val="24"/>
+          <w:vertAlign w:val="subscript"/>
+        </w:rPr>
+        <w:t>c</w:t>
+      </w:r>
+      <w:r>
+        <w:rPr>
+          <w:rFonts w:ascii="Times New Roman" w:hAnsi="Times New Roman"/>
+          <w:i w:val="0"/>
+          <w:sz w:val="24"/>
+        </w:rPr>
+        <w:t>)  +  x</w:t>
+      </w:r>
+      <w:r>
+        <w:rPr>
+          <w:rFonts w:ascii="Times New Roman" w:hAnsi="Times New Roman"/>
+          <w:i/>
+          <w:sz w:val="24"/>
+          <w:vertAlign w:val="subscript"/>
+        </w:rPr>
+        <w:t>c</w:t>
+      </w:r>
+      <w:r>
+        <w:rPr>
+          <w:rFonts w:ascii="Times New Roman" w:hAnsi="Times New Roman"/>
+          <w:i w:val="0"/>
+          <w:sz w:val="24"/>
+        </w:rPr>
+        <w:t>′γ  +  ε</w:t>
+      </w:r>
+      <w:r>
+        <w:rPr>
+          <w:rFonts w:ascii="Times New Roman" w:hAnsi="Times New Roman"/>
+          <w:i/>
+          <w:sz w:val="24"/>
+          <w:vertAlign w:val="subscript"/>
+        </w:rPr>
+        <w:t>c</w:t>
+      </w:r>
+      <w:r>
+        <w:rPr>
+          <w:rFonts w:ascii="Times New Roman" w:hAnsi="Times New Roman"/>
+          <w:sz w:val="24"/>
+        </w:rPr>
+        <w:t xml:space="preserve">    (3)</w:t>
       </w:r>
     </w:p>
     <w:p>
@@ -2441,6 +2817,61 @@
           <w:sz w:val="24"/>
         </w:rPr>
         <w:t>5.1  Depression Prevalence</w:t>
+      </w:r>
+    </w:p>
+    <w:p>
+      <w:pPr>
+        <w:spacing w:before="240" w:after="80"/>
+        <w:jc w:val="center"/>
+      </w:pPr>
+      <w:r>
+        <w:drawing>
+          <wp:inline xmlns:a="http://schemas.openxmlformats.org/drawingml/2006/main" xmlns:pic="http://schemas.openxmlformats.org/drawingml/2006/picture">
+            <wp:extent cx="4114800" cy="1719454"/>
+            <wp:docPr id="2" name="Picture 2"/>
+            <wp:cNvGraphicFramePr>
+              <a:graphicFrameLocks noChangeAspect="1"/>
+            </wp:cNvGraphicFramePr>
+            <a:graphic>
+              <a:graphicData uri="http://schemas.openxmlformats.org/drawingml/2006/picture">
+                <pic:pic>
+                  <pic:nvPicPr>
+                    <pic:cNvPr id="0" name="fig_depression_coefplot.png"/>
+                    <pic:cNvPicPr/>
+                  </pic:nvPicPr>
+                  <pic:blipFill>
+                    <a:blip r:embed="rId10"/>
+                    <a:stretch>
+                      <a:fillRect/>
+                    </a:stretch>
+                  </pic:blipFill>
+                  <pic:spPr>
+                    <a:xfrm>
+                      <a:off x="0" y="0"/>
+                      <a:ext cx="4114800" cy="1719454"/>
+                    </a:xfrm>
+                    <a:prstGeom prst="rect"/>
+                  </pic:spPr>
+                </pic:pic>
+              </a:graphicData>
+            </a:graphic>
+          </wp:inline>
+        </w:drawing>
+      </w:r>
+    </w:p>
+    <w:p>
+      <w:pPr>
+        <w:spacing w:line="276" w:lineRule="auto" w:before="0" w:after="240"/>
+        <w:jc w:val="center"/>
+      </w:pPr>
+      <w:r>
+        <w:rPr>
+          <w:rFonts w:ascii="Times New Roman" w:hAnsi="Times New Roman"/>
+          <w:b w:val="0"/>
+          <w:i/>
+          <w:sz w:val="20"/>
+        </w:rPr>
+        <w:t>Figure 2. Treatment Effects on Depression Prevalence and Poor Mental Health Days (2019). T1 binary treatment estimate (filled circle) and dose-response estimate (open diamond) with 95% confidence intervals. Panel A: depression prevalence (%). Panel B: poor mental health days (%). *** p&lt;0.01, ** p&lt;0.05, * p&lt;0.10. Heteroskedasticity-robust SEs.</w:t>
       </w:r>
     </w:p>
     <w:p>
@@ -3494,101 +3925,7 @@
           <w:i w:val="0"/>
           <w:sz w:val="24"/>
         </w:rPr>
-        <w:t>A fifth and related limitation concerns data availability for mental health providers and service utilization at the county level during the study window. The HPSA designation used as a covariate in the cross-sectional specifications identifies counties with a structural shortage of mental health providers, but it does not measure the actual volume of mental health encounters, prescription fills, or inpatient psychiatric admissions before and after the fires. If treated counties saw large increases in provider visits or antidepressant prescriptions following the fires, that utilization data could be used to distinguish between true increases in mental health need and changes in how residents seek or access care. Without utilization data, the depression prevalence estimate captures the net effect on measured outcomes, but does not decompose the behavioral and clinical responses that produced it. Future work combining insurance claims or Medicaid administrative data with the matched DiD design used here would substantially enrich the interpretation of these county-level prevalence findings.</w:t>
-      </w:r>
-    </w:p>
-    <w:p>
-      <w:pPr>
-        <w:spacing w:line="276" w:lineRule="auto" w:before="0" w:after="0"/>
-        <w:ind w:firstLine="720"/>
-        <w:jc w:val="left"/>
-      </w:pPr>
-      <w:r>
-        <w:rPr>
-          <w:rFonts w:ascii="Times New Roman" w:hAnsi="Times New Roman"/>
-          <w:b w:val="0"/>
-          <w:i w:val="0"/>
-          <w:sz w:val="24"/>
-        </w:rPr>
         <w:t>Wildfires are becoming more frequent and more severe across the American West, and there is no credible forecast in which that trend reverses in the near term. The physical costs, such as burned structures, destroyed ecosystems, and respiratory hospitalizations, are visible, well-documented, and reflected in insurance premiums, emergency budgets, and infrastructure planning. The mental health costs have been harder to quantify. They do not show up in satellite imagery or fire perimeter maps. They accumulate quietly in the households and clinics of communities that were living with wildfire long before it became a national news story. This paper is an attempt to make those costs visible in the data, to provide a number that planners and policymakers can use when deciding whether to fund a mobile mental health clinic in a fire-affected rural county, extend a telemedicine waiver for another year, or invest in community mental health infrastructure in places that need it most. The answer this paper gives is that the need is real, it is large enough to measure, and four years after the fires, it has not resolved on its own.</w:t>
-      </w:r>
-    </w:p>
-    <w:p>
-      <w:pPr>
-        <w:spacing w:line="276" w:lineRule="auto" w:before="0" w:after="0"/>
-        <w:ind w:firstLine="720"/>
-        <w:jc w:val="left"/>
-      </w:pPr>
-      <w:r>
-        <w:rPr>
-          <w:rFonts w:ascii="Times New Roman" w:hAnsi="Times New Roman"/>
-          <w:b w:val="0"/>
-          <w:i w:val="0"/>
-          <w:sz w:val="24"/>
-        </w:rPr>
-        <w:t>The scale of the problem documented here justifies a reconsideration of how mental health is incorporated into wildfire cost accounting. Wildfire suppression costs are tracked precisely and reported annually by the National Interagency Fire Center. The Federal Emergency Management Agency tracks property losses. The U.S. Forest Service maintains detailed records of resource expenditures, air tanker hours, and firefighter deployments. None of these accounting systems include a line for long-run behavioral health burden. When a county burns, the economic accounting of the disaster captures rebuilding costs, business interruption, and livestock losses, but it does not include the mental health treatment costs, the lost productivity from depression, or the increased healthcare utilization that persists for years afterward. The evidence in this paper suggests those uncounted costs are not trivial. If even half the counties that experience major wildfire events show a depression prevalence increase of 2 to 3 percentage points, and if even a fraction of that increase results in clinical treatment, lost workdays, or other measurable economic harm, the aggregate cost across hundreds of fire-affected counties per decade would be substantial. Integrating long-run behavioral health surveillance into the standard wildfire cost accounting framework would make these costs visible and enable more complete cost-benefit analyses of wildfire prevention, suppression, and community resilience investments.</w:t>
-      </w:r>
-    </w:p>
-    <w:p>
-      <w:pPr>
-        <w:spacing w:line="276" w:lineRule="auto" w:before="0" w:after="0"/>
-        <w:ind w:firstLine="720"/>
-        <w:jc w:val="left"/>
-      </w:pPr>
-      <w:r>
-        <w:rPr>
-          <w:rFonts w:ascii="Times New Roman" w:hAnsi="Times New Roman"/>
-          <w:b w:val="0"/>
-          <w:i w:val="0"/>
-          <w:sz w:val="24"/>
-        </w:rPr>
-        <w:t>Figure 1. Common Support: Covariate Overlap Between Treated and Matched Controls (T1, &gt;=1,000 acres)</w:t>
-      </w:r>
-    </w:p>
-    <w:p>
-      <w:pPr>
-        <w:spacing w:line="276" w:lineRule="auto" w:before="0" w:after="120"/>
-        <w:jc w:val="left"/>
-      </w:pPr>
-      <w:r>
-        <w:rPr>
-          <w:rFonts w:ascii="Times New Roman" w:hAnsi="Times New Roman"/>
-          <w:b w:val="0"/>
-          <w:i/>
-          <w:sz w:val="20"/>
-        </w:rPr>
-        <w:t>Notes: Treated counties experienced a qualifying 2015 wildfire (T1, &gt;= 1,000 acres). Controls matched within WHP quintiles via Mahalanobis distance. Top-left: WHP national rank distributions; vertical dashed lines mark quintile boundaries (0.2, 0.4, 0.6, 0.8). Top-right: paired WHP ranks colored by quintile; 45-degree line = perfect match. Bottom panels: RUCC and pre-treatment unemployment rate distributions. Near-identical distributions confirm common support across all matching dimensions.</w:t>
-      </w:r>
-    </w:p>
-    <w:p>
-      <w:pPr>
-        <w:spacing w:line="276" w:lineRule="auto" w:before="0" w:after="0"/>
-        <w:ind w:firstLine="720"/>
-        <w:jc w:val="left"/>
-      </w:pPr>
-      <w:r>
-        <w:rPr>
-          <w:rFonts w:ascii="Times New Roman" w:hAnsi="Times New Roman"/>
-          <w:b w:val="0"/>
-          <w:i w:val="0"/>
-          <w:sz w:val="24"/>
-        </w:rPr>
-        <w:t>Figure 2. Treatment Effects on Depression Prevalence and Poor Mental Health Days (2019)</w:t>
-      </w:r>
-    </w:p>
-    <w:p>
-      <w:pPr>
-        <w:spacing w:line="276" w:lineRule="auto" w:before="0" w:after="120"/>
-        <w:jc w:val="left"/>
-      </w:pPr>
-      <w:r>
-        <w:rPr>
-          <w:rFonts w:ascii="Times New Roman" w:hAnsi="Times New Roman"/>
-          <w:b w:val="0"/>
-          <w:i/>
-          <w:sz w:val="20"/>
-        </w:rPr>
-        <w:t>Notes: Coefficient plot summarizing Table 2. T1 binary treatment estimate (filled circle) and dose-response estimate (open diamond) with 95% confidence intervals. Panel A: CDC PLACES depression prevalence (%). Panel B: CDC PLACES poor mental health days (%). Filled circles = binary treatment indicator (T1, &gt;= 1,000 acres); open diamond = log(1 + PctBurned) dose-response among T1 treated counties. *** p &lt; 0.01, ** p &lt; 0.05, * p &lt; 0.10. Heteroskedasticity-robust SEs.</w:t>
       </w:r>
     </w:p>
     <w:p>

</xml_diff>